<commit_message>
fix(docx): use visible table grid borders in the default report profile
</commit_message>
<xml_diff>
--- a/resources/skills/docx-generation/assets/reference.docx
+++ b/resources/skills/docx-generation/assets/reference.docx
@@ -1018,8 +1018,19 @@
     <w:name w:val="Table"/>
     <w:basedOn w:val="TableNormal"/>
     <w:qFormat/>
+    <w:rPr>
+      <w:sz w:val="21"/>
+    </w:rPr>
     <w:tblPr>
       <w:tblInd w:w="0" w:type="dxa"/>
+      <w:tblBorders>
+        <w:top w:val="single" w:sz="4" w:color="808080" w:space="0"/>
+        <w:left w:val="single" w:sz="4" w:color="808080" w:space="0"/>
+        <w:bottom w:val="single" w:sz="4" w:color="808080" w:space="0"/>
+        <w:right w:val="single" w:sz="4" w:color="808080" w:space="0"/>
+        <w:insideH w:val="single" w:sz="4" w:color="808080" w:space="0"/>
+        <w:insideV w:val="single" w:sz="4" w:color="808080" w:space="0"/>
+      </w:tblBorders>
       <w:tblCellMar>
         <w:top w:w="0" w:type="dxa"/>
         <w:left w:w="108" w:type="dxa"/>
@@ -1028,20 +1039,13 @@
       </w:tblCellMar>
     </w:tblPr>
     <w:tblStylePr w:type="firstRow">
-      <w:tcPr>
-        <w:tcBorders>
-          <w:bottom w:val="single"/>
-        </w:tcBorders>
-        <w:vAlign w:val="bottom"/>
-        <w:shd w:fill="F2F4F7" w:val="clear"/>
-      </w:tcPr>
       <w:rPr>
         <w:b/>
       </w:rPr>
+      <w:tcPr>
+        <w:vAlign w:val="bottom"/>
+      </w:tcPr>
     </w:tblStylePr>
-    <w:rPr>
-      <w:sz w:val="21"/>
-    </w:rPr>
   </w:style>
   <w:style w:type="paragraph" w:customStyle="1" w:styleId="DefinitionTerm">
     <w:name w:val="Definition Term"/>

</xml_diff>

<commit_message>
fix(docx): apply coordinated report typography and page layout
</commit_message>
<xml_diff>
--- a/resources/skills/docx-generation/assets/reference.docx
+++ b/resources/skills/docx-generation/assets/reference.docx
@@ -318,6 +318,7 @@
         <w:numRestart w:val="eachSect"/>
       </w:footnotePr>
       <w:pgSz w:w="11906" w:h="16838"/>
+      <w:pgMar w:top="1134" w:right="1134" w:bottom="1134" w:left="1134" w:header="851" w:footer="992" w:gutter="0"/>
     </w:sectPr>
   </w:body>
 </w:document>
@@ -486,9 +487,10 @@
   <w:docDefaults>
     <w:rPrDefault>
       <w:rPr>
-        <w:rFonts w:asciiTheme="minorHAnsi" w:eastAsiaTheme="minorEastAsia" w:hAnsiTheme="minorHAnsi" w:cstheme="minorBidi"/>
-        <w:sz w:val="24"/>
-        <w:szCs w:val="24"/>
+        <w:rFonts w:ascii="Arial" w:hAnsi="Arial" w:eastAsia="PingFang SC" w:cs="Arial"/>
+        <w:color w:val="24292F"/>
+        <w:sz w:val="21"/>
+        <w:szCs w:val="21"/>
         <w:lang w:val="en-US" w:eastAsia="zh-CN" w:bidi="ar-SA"/>
       </w:rPr>
     </w:rPrDefault>
@@ -502,6 +504,9 @@
   <w:style w:type="paragraph" w:default="1" w:styleId="Normal">
     <w:name w:val="Normal"/>
     <w:qFormat/>
+    <w:pPr>
+      <w:spacing w:before="40" w:after="120" w:line="320" w:lineRule="auto"/>
+    </w:pPr>
   </w:style>
   <w:style w:type="paragraph" w:styleId="BodyText">
     <w:name w:val="Body Text"/>
@@ -509,7 +514,7 @@
     <w:link w:val="BodyTextChar"/>
     <w:qFormat/>
     <w:pPr>
-      <w:spacing w:before="180" w:after="180"/>
+      <w:spacing w:before="40" w:after="120" w:line="320" w:lineRule="auto"/>
     </w:pPr>
   </w:style>
   <w:style w:type="paragraph" w:customStyle="1" w:styleId="FirstParagraph">
@@ -517,13 +522,16 @@
     <w:basedOn w:val="BodyText"/>
     <w:next w:val="BodyText"/>
     <w:qFormat/>
+    <w:pPr>
+      <w:spacing w:before="40" w:after="120" w:line="320" w:lineRule="auto"/>
+    </w:pPr>
   </w:style>
   <w:style w:type="paragraph" w:customStyle="1" w:styleId="Compact">
     <w:name w:val="Compact"/>
     <w:basedOn w:val="BodyText"/>
     <w:qFormat/>
     <w:pPr>
-      <w:spacing w:before="36" w:after="36"/>
+      <w:spacing w:before="20" w:after="60" w:line="300" w:lineRule="auto"/>
     </w:pPr>
   </w:style>
   <w:style w:type="paragraph" w:styleId="Title">
@@ -535,14 +543,17 @@
     <w:qFormat/>
     <w:rsid w:val="00A10FD9"/>
     <w:pPr>
-      <w:spacing w:after="80" w:line="240" w:lineRule="auto"/>
+      <w:spacing w:before="0" w:after="240" w:line="280" w:lineRule="auto"/>
       <w:contextualSpacing/>
       <w:jc w:val="center"/>
     </w:pPr>
     <w:rPr>
-      <w:rFonts w:asciiTheme="majorHAnsi" w:eastAsiaTheme="majorEastAsia" w:hAnsiTheme="majorHAnsi" w:cstheme="majorBidi"/>
-      <w:sz w:val="56"/>
-      <w:szCs w:val="56"/>
+      <w:rFonts w:ascii="Arial" w:hAnsi="Arial" w:eastAsia="PingFang SC" w:cs="Arial"/>
+      <w:b w:val="1"/>
+      <w:bCs w:val="1"/>
+      <w:color w:val="12324F"/>
+      <w:sz w:val="34"/>
+      <w:szCs w:val="34"/>
     </w:rPr>
   </w:style>
   <w:style w:type="character" w:customStyle="1" w:styleId="TitleChar">
@@ -552,9 +563,12 @@
     <w:uiPriority w:val="10"/>
     <w:rsid w:val="00A10FD9"/>
     <w:rPr>
-      <w:rFonts w:asciiTheme="majorHAnsi" w:eastAsiaTheme="majorEastAsia" w:hAnsiTheme="majorHAnsi" w:cstheme="majorBidi"/>
-      <w:sz w:val="56"/>
-      <w:szCs w:val="56"/>
+      <w:rFonts w:ascii="Arial" w:hAnsi="Arial" w:eastAsia="PingFang SC" w:cs="Arial"/>
+      <w:b w:val="1"/>
+      <w:bCs w:val="1"/>
+      <w:color w:val="12324F"/>
+      <w:sz w:val="34"/>
+      <w:szCs w:val="34"/>
     </w:rPr>
   </w:style>
   <w:style w:type="paragraph" w:styleId="Subtitle">
@@ -670,14 +684,16 @@
     <w:pPr>
       <w:keepNext/>
       <w:keepLines/>
-      <w:spacing w:before="360" w:after="80"/>
+      <w:spacing w:before="0" w:after="240" w:line="280" w:lineRule="auto"/>
       <w:outlineLvl w:val="0"/>
     </w:pPr>
     <w:rPr>
-      <w:rFonts w:asciiTheme="majorHAnsi" w:eastAsiaTheme="majorEastAsia" w:hAnsiTheme="majorHAnsi" w:cstheme="majorBidi"/>
-      <w:color w:val="0F4761" w:themeColor="accent1" w:themeShade="BF"/>
-      <w:sz w:val="40"/>
-      <w:szCs w:val="40"/>
+      <w:rFonts w:ascii="Arial" w:hAnsi="Arial" w:eastAsia="PingFang SC" w:cs="Arial"/>
+      <w:b w:val="1"/>
+      <w:bCs w:val="1"/>
+      <w:color w:val="12324F"/>
+      <w:sz w:val="34"/>
+      <w:szCs w:val="34"/>
     </w:rPr>
   </w:style>
   <w:style w:type="paragraph" w:styleId="Heading2">
@@ -693,14 +709,16 @@
     <w:pPr>
       <w:keepNext/>
       <w:keepLines/>
-      <w:spacing w:before="160" w:after="80"/>
+      <w:spacing w:before="360" w:after="160" w:line="280" w:lineRule="auto"/>
       <w:outlineLvl w:val="1"/>
     </w:pPr>
     <w:rPr>
-      <w:rFonts w:asciiTheme="majorHAnsi" w:eastAsiaTheme="majorEastAsia" w:hAnsiTheme="majorHAnsi" w:cstheme="majorBidi"/>
-      <w:color w:val="0F4761" w:themeColor="accent1" w:themeShade="BF"/>
-      <w:sz w:val="32"/>
-      <w:szCs w:val="32"/>
+      <w:rFonts w:ascii="Arial" w:hAnsi="Arial" w:eastAsia="PingFang SC" w:cs="Arial"/>
+      <w:b w:val="1"/>
+      <w:bCs w:val="1"/>
+      <w:color w:val="1F4E79"/>
+      <w:sz w:val="28"/>
+      <w:szCs w:val="28"/>
     </w:rPr>
   </w:style>
   <w:style w:type="paragraph" w:styleId="Heading3">
@@ -716,14 +734,16 @@
     <w:pPr>
       <w:keepNext/>
       <w:keepLines/>
-      <w:spacing w:before="160" w:after="80"/>
+      <w:spacing w:before="240" w:after="120" w:line="280" w:lineRule="auto"/>
       <w:outlineLvl w:val="2"/>
     </w:pPr>
     <w:rPr>
-      <w:rFonts w:eastAsiaTheme="majorEastAsia" w:cstheme="majorBidi"/>
-      <w:color w:val="0F4761" w:themeColor="accent1" w:themeShade="BF"/>
-      <w:sz w:val="28"/>
-      <w:szCs w:val="28"/>
+      <w:rFonts w:ascii="Arial" w:hAnsi="Arial" w:eastAsia="PingFang SC" w:cs="Arial"/>
+      <w:b w:val="1"/>
+      <w:bCs w:val="1"/>
+      <w:color w:val="2E6DA4"/>
+      <w:sz w:val="23"/>
+      <w:szCs w:val="23"/>
     </w:rPr>
   </w:style>
   <w:style w:type="paragraph" w:styleId="Heading4">
@@ -739,14 +759,18 @@
     <w:pPr>
       <w:keepNext/>
       <w:keepLines/>
-      <w:spacing w:before="80" w:after="40"/>
+      <w:spacing w:before="200" w:after="100" w:line="280" w:lineRule="auto"/>
       <w:outlineLvl w:val="3"/>
     </w:pPr>
     <w:rPr>
-      <w:rFonts w:eastAsiaTheme="majorEastAsia" w:cstheme="majorBidi"/>
+      <w:rFonts w:ascii="Arial" w:hAnsi="Arial" w:eastAsia="PingFang SC" w:cs="Arial"/>
+      <w:b w:val="1"/>
+      <w:bCs w:val="1"/>
       <w:i/>
       <w:iCs/>
-      <w:color w:val="0F4761" w:themeColor="accent1" w:themeShade="BF"/>
+      <w:color w:val="24292F"/>
+      <w:sz w:val="21"/>
+      <w:szCs w:val="21"/>
     </w:rPr>
   </w:style>
   <w:style w:type="paragraph" w:styleId="Heading5">
@@ -762,12 +786,16 @@
     <w:pPr>
       <w:keepNext/>
       <w:keepLines/>
-      <w:spacing w:before="80" w:after="40"/>
+      <w:spacing w:before="200" w:after="100" w:line="280" w:lineRule="auto"/>
       <w:outlineLvl w:val="4"/>
     </w:pPr>
     <w:rPr>
-      <w:rFonts w:eastAsiaTheme="majorEastAsia" w:cstheme="majorBidi"/>
-      <w:color w:val="0F4761" w:themeColor="accent1" w:themeShade="BF"/>
+      <w:rFonts w:ascii="Arial" w:hAnsi="Arial" w:eastAsia="PingFang SC" w:cs="Arial"/>
+      <w:b w:val="1"/>
+      <w:bCs w:val="1"/>
+      <w:color w:val="24292F"/>
+      <w:sz w:val="21"/>
+      <w:szCs w:val="21"/>
     </w:rPr>
   </w:style>
   <w:style w:type="paragraph" w:styleId="Heading6">
@@ -783,14 +811,18 @@
     <w:pPr>
       <w:keepNext/>
       <w:keepLines/>
-      <w:spacing w:before="40" w:after="0"/>
+      <w:spacing w:before="200" w:after="100" w:line="280" w:lineRule="auto"/>
       <w:outlineLvl w:val="5"/>
     </w:pPr>
     <w:rPr>
-      <w:rFonts w:eastAsiaTheme="majorEastAsia" w:cstheme="majorBidi"/>
+      <w:rFonts w:ascii="Arial" w:hAnsi="Arial" w:eastAsia="PingFang SC" w:cs="Arial"/>
+      <w:b w:val="1"/>
+      <w:bCs w:val="1"/>
       <w:i/>
       <w:iCs/>
-      <w:color w:val="595959" w:themeColor="text1" w:themeTint="A6"/>
+      <w:color w:val="24292F"/>
+      <w:sz w:val="21"/>
+      <w:szCs w:val="21"/>
     </w:rPr>
   </w:style>
   <w:style w:type="paragraph" w:styleId="Heading7">
@@ -806,12 +838,16 @@
     <w:pPr>
       <w:keepNext/>
       <w:keepLines/>
-      <w:spacing w:before="40" w:after="0"/>
+      <w:spacing w:before="200" w:after="100" w:line="280" w:lineRule="auto"/>
       <w:outlineLvl w:val="6"/>
     </w:pPr>
     <w:rPr>
-      <w:rFonts w:eastAsiaTheme="majorEastAsia" w:cstheme="majorBidi"/>
-      <w:color w:val="595959" w:themeColor="text1" w:themeTint="A6"/>
+      <w:rFonts w:ascii="Arial" w:hAnsi="Arial" w:eastAsia="PingFang SC" w:cs="Arial"/>
+      <w:b w:val="1"/>
+      <w:bCs w:val="1"/>
+      <w:color w:val="24292F"/>
+      <w:sz w:val="21"/>
+      <w:szCs w:val="21"/>
     </w:rPr>
   </w:style>
   <w:style w:type="paragraph" w:styleId="Heading8">
@@ -827,14 +863,18 @@
     <w:pPr>
       <w:keepNext/>
       <w:keepLines/>
-      <w:spacing w:after="0"/>
+      <w:spacing w:before="200" w:after="100" w:line="280" w:lineRule="auto"/>
       <w:outlineLvl w:val="7"/>
     </w:pPr>
     <w:rPr>
-      <w:rFonts w:eastAsiaTheme="majorEastAsia" w:cstheme="majorBidi"/>
+      <w:rFonts w:ascii="Arial" w:hAnsi="Arial" w:eastAsia="PingFang SC" w:cs="Arial"/>
+      <w:b w:val="1"/>
+      <w:bCs w:val="1"/>
       <w:i/>
       <w:iCs/>
-      <w:color w:val="272727" w:themeColor="text1" w:themeTint="D8"/>
+      <w:color w:val="24292F"/>
+      <w:sz w:val="21"/>
+      <w:szCs w:val="21"/>
     </w:rPr>
   </w:style>
   <w:style w:type="paragraph" w:styleId="Heading9">
@@ -850,12 +890,16 @@
     <w:pPr>
       <w:keepNext/>
       <w:keepLines/>
-      <w:spacing w:after="0"/>
+      <w:spacing w:before="200" w:after="100" w:line="280" w:lineRule="auto"/>
       <w:outlineLvl w:val="8"/>
     </w:pPr>
     <w:rPr>
-      <w:rFonts w:eastAsiaTheme="majorEastAsia" w:cstheme="majorBidi"/>
-      <w:color w:val="272727" w:themeColor="text1" w:themeTint="D8"/>
+      <w:rFonts w:ascii="Arial" w:hAnsi="Arial" w:eastAsia="PingFang SC" w:cs="Arial"/>
+      <w:b w:val="1"/>
+      <w:bCs w:val="1"/>
+      <w:color w:val="24292F"/>
+      <w:sz w:val="21"/>
+      <w:szCs w:val="21"/>
     </w:rPr>
   </w:style>
   <w:style w:type="character" w:customStyle="1" w:styleId="Heading1Char">
@@ -865,10 +909,12 @@
     <w:uiPriority w:val="9"/>
     <w:rsid w:val="00A10FD9"/>
     <w:rPr>
-      <w:rFonts w:asciiTheme="majorHAnsi" w:eastAsiaTheme="majorEastAsia" w:hAnsiTheme="majorHAnsi" w:cstheme="majorBidi"/>
-      <w:color w:val="0F4761" w:themeColor="accent1" w:themeShade="BF"/>
-      <w:sz w:val="40"/>
-      <w:szCs w:val="40"/>
+      <w:rFonts w:ascii="Arial" w:hAnsi="Arial" w:eastAsia="PingFang SC" w:cs="Arial"/>
+      <w:b w:val="1"/>
+      <w:bCs w:val="1"/>
+      <w:color w:val="12324F"/>
+      <w:sz w:val="34"/>
+      <w:szCs w:val="34"/>
     </w:rPr>
   </w:style>
   <w:style w:type="character" w:customStyle="1" w:styleId="Heading2Char">
@@ -879,10 +925,12 @@
     <w:semiHidden/>
     <w:rsid w:val="00A10FD9"/>
     <w:rPr>
-      <w:rFonts w:asciiTheme="majorHAnsi" w:eastAsiaTheme="majorEastAsia" w:hAnsiTheme="majorHAnsi" w:cstheme="majorBidi"/>
-      <w:color w:val="0F4761" w:themeColor="accent1" w:themeShade="BF"/>
-      <w:sz w:val="32"/>
-      <w:szCs w:val="32"/>
+      <w:rFonts w:ascii="Arial" w:hAnsi="Arial" w:eastAsia="PingFang SC" w:cs="Arial"/>
+      <w:b w:val="1"/>
+      <w:bCs w:val="1"/>
+      <w:color w:val="1F4E79"/>
+      <w:sz w:val="28"/>
+      <w:szCs w:val="28"/>
     </w:rPr>
   </w:style>
   <w:style w:type="character" w:customStyle="1" w:styleId="Heading3Char">
@@ -893,10 +941,12 @@
     <w:semiHidden/>
     <w:rsid w:val="00A10FD9"/>
     <w:rPr>
-      <w:rFonts w:eastAsiaTheme="majorEastAsia" w:cstheme="majorBidi"/>
-      <w:color w:val="0F4761" w:themeColor="accent1" w:themeShade="BF"/>
-      <w:sz w:val="28"/>
-      <w:szCs w:val="28"/>
+      <w:rFonts w:ascii="Arial" w:hAnsi="Arial" w:eastAsia="PingFang SC" w:cs="Arial"/>
+      <w:b w:val="1"/>
+      <w:bCs w:val="1"/>
+      <w:color w:val="2E6DA4"/>
+      <w:sz w:val="23"/>
+      <w:szCs w:val="23"/>
     </w:rPr>
   </w:style>
   <w:style w:type="character" w:customStyle="1" w:styleId="Heading4Char">
@@ -907,10 +957,14 @@
     <w:semiHidden/>
     <w:rsid w:val="00A10FD9"/>
     <w:rPr>
-      <w:rFonts w:eastAsiaTheme="majorEastAsia" w:cstheme="majorBidi"/>
+      <w:rFonts w:ascii="Arial" w:hAnsi="Arial" w:eastAsia="PingFang SC" w:cs="Arial"/>
+      <w:b w:val="1"/>
+      <w:bCs w:val="1"/>
       <w:i/>
       <w:iCs/>
-      <w:color w:val="0F4761" w:themeColor="accent1" w:themeShade="BF"/>
+      <w:color w:val="24292F"/>
+      <w:sz w:val="21"/>
+      <w:szCs w:val="21"/>
     </w:rPr>
   </w:style>
   <w:style w:type="character" w:customStyle="1" w:styleId="Heading5Char">
@@ -921,8 +975,12 @@
     <w:semiHidden/>
     <w:rsid w:val="00A10FD9"/>
     <w:rPr>
-      <w:rFonts w:eastAsiaTheme="majorEastAsia" w:cstheme="majorBidi"/>
-      <w:color w:val="0F4761" w:themeColor="accent1" w:themeShade="BF"/>
+      <w:rFonts w:ascii="Arial" w:hAnsi="Arial" w:eastAsia="PingFang SC" w:cs="Arial"/>
+      <w:b w:val="1"/>
+      <w:bCs w:val="1"/>
+      <w:color w:val="24292F"/>
+      <w:sz w:val="21"/>
+      <w:szCs w:val="21"/>
     </w:rPr>
   </w:style>
   <w:style w:type="character" w:customStyle="1" w:styleId="Heading6Char">
@@ -933,10 +991,14 @@
     <w:semiHidden/>
     <w:rsid w:val="00A10FD9"/>
     <w:rPr>
-      <w:rFonts w:eastAsiaTheme="majorEastAsia" w:cstheme="majorBidi"/>
+      <w:rFonts w:ascii="Arial" w:hAnsi="Arial" w:eastAsia="PingFang SC" w:cs="Arial"/>
+      <w:b w:val="1"/>
+      <w:bCs w:val="1"/>
       <w:i/>
       <w:iCs/>
-      <w:color w:val="595959" w:themeColor="text1" w:themeTint="A6"/>
+      <w:color w:val="24292F"/>
+      <w:sz w:val="21"/>
+      <w:szCs w:val="21"/>
     </w:rPr>
   </w:style>
   <w:style w:type="character" w:customStyle="1" w:styleId="Heading7Char">
@@ -947,8 +1009,12 @@
     <w:semiHidden/>
     <w:rsid w:val="00A10FD9"/>
     <w:rPr>
-      <w:rFonts w:eastAsiaTheme="majorEastAsia" w:cstheme="majorBidi"/>
-      <w:color w:val="595959" w:themeColor="text1" w:themeTint="A6"/>
+      <w:rFonts w:ascii="Arial" w:hAnsi="Arial" w:eastAsia="PingFang SC" w:cs="Arial"/>
+      <w:b w:val="1"/>
+      <w:bCs w:val="1"/>
+      <w:color w:val="24292F"/>
+      <w:sz w:val="21"/>
+      <w:szCs w:val="21"/>
     </w:rPr>
   </w:style>
   <w:style w:type="character" w:customStyle="1" w:styleId="Heading8Char">
@@ -959,10 +1025,14 @@
     <w:semiHidden/>
     <w:rsid w:val="00A10FD9"/>
     <w:rPr>
-      <w:rFonts w:eastAsiaTheme="majorEastAsia" w:cstheme="majorBidi"/>
+      <w:rFonts w:ascii="Arial" w:hAnsi="Arial" w:eastAsia="PingFang SC" w:cs="Arial"/>
+      <w:b w:val="1"/>
+      <w:bCs w:val="1"/>
       <w:i/>
       <w:iCs/>
-      <w:color w:val="272727" w:themeColor="text1" w:themeTint="D8"/>
+      <w:color w:val="24292F"/>
+      <w:sz w:val="21"/>
+      <w:szCs w:val="21"/>
     </w:rPr>
   </w:style>
   <w:style w:type="character" w:customStyle="1" w:styleId="Heading9Char">
@@ -973,8 +1043,12 @@
     <w:semiHidden/>
     <w:rsid w:val="00A10FD9"/>
     <w:rPr>
-      <w:rFonts w:eastAsiaTheme="majorEastAsia" w:cstheme="majorBidi"/>
-      <w:color w:val="272727" w:themeColor="text1" w:themeTint="D8"/>
+      <w:rFonts w:ascii="Arial" w:hAnsi="Arial" w:eastAsia="PingFang SC" w:cs="Arial"/>
+      <w:b w:val="1"/>
+      <w:bCs w:val="1"/>
+      <w:color w:val="24292F"/>
+      <w:sz w:val="21"/>
+      <w:szCs w:val="21"/>
     </w:rPr>
   </w:style>
   <w:style w:type="paragraph" w:styleId="BlockText">
@@ -1019,7 +1093,9 @@
     <w:basedOn w:val="TableNormal"/>
     <w:qFormat/>
     <w:rPr>
-      <w:sz w:val="21"/>
+      <w:rFonts w:ascii="Arial" w:hAnsi="Arial" w:eastAsia="PingFang SC" w:cs="Arial"/>
+      <w:sz w:val="19"/>
+      <w:szCs w:val="19"/>
     </w:rPr>
     <w:tblPr>
       <w:tblInd w:w="0" w:type="dxa"/>
@@ -1032,10 +1108,10 @@
         <w:insideV w:val="single" w:sz="4" w:color="808080" w:space="0"/>
       </w:tblBorders>
       <w:tblCellMar>
-        <w:top w:w="0" w:type="dxa"/>
-        <w:left w:w="108" w:type="dxa"/>
-        <w:bottom w:w="0" w:type="dxa"/>
-        <w:right w:w="108" w:type="dxa"/>
+        <w:top w:w="60" w:type="dxa"/>
+        <w:left w:w="80" w:type="dxa"/>
+        <w:bottom w:w="60" w:type="dxa"/>
+        <w:right w:w="80" w:type="dxa"/>
       </w:tblCellMar>
     </w:tblPr>
     <w:tblStylePr w:type="firstRow">
@@ -1150,10 +1226,12 @@
     <w:name w:val="Table Body"/>
     <w:basedOn w:val="Normal"/>
     <w:pPr>
-      <w:spacing w:before="0" w:after="40" w:line="240" w:lineRule="auto"/>
-    </w:pPr>
-    <w:rPr>
-      <w:sz w:val="21"/>
+      <w:spacing w:before="20" w:after="20" w:line="240" w:lineRule="auto"/>
+    </w:pPr>
+    <w:rPr>
+      <w:rFonts w:ascii="Arial" w:hAnsi="Arial" w:eastAsia="PingFang SC" w:cs="Arial"/>
+      <w:sz w:val="19"/>
+      <w:szCs w:val="19"/>
     </w:rPr>
   </w:style>
 </w:styles>

</xml_diff>